<commit_message>
Separate rating from ranking in the method and results chapters
- Describe the Delphi rounds as ratings (امتیاز) on a five-point scale;
  reserve ranking for the final order of components and items
- State the item-removal rule (mean below 3 in round two) and what
  follows when no item is removed; the Kendall calculation is described
  (ratings converted to ranks within each expert, ties averaged)
- Use the six thematic-analysis phases of Braun and Clarke consistently
  in chapter four, with the open-coding step attributed to Bingham
- Complete the AHP introduction and the chapter summary with the AHP
  weights; describe the change in Kendall's W as a marked increase
  rather than a significant one, since no test of the difference was run

Claude-Session: https://claude.ai/code/session_012d4zYSXkv12fA3MhDxMQzc
</commit_message>
<xml_diff>
--- a/chapter3_revised.docx
+++ b/chapter3_revised.docx
@@ -1237,14 +1237,13 @@
         <w:rPr>
           <w:rtl/>
         </w:rPr>
-        <w:t xml:space="preserve">در دورهای بعدی، پرسشنامه بر پایه گویه‌های استخراج‌شده از دور نخست بازطراحی شد و از هر عضو پانل خواسته شد میزان اهمیت هر گویه را رتبه‌بندی کند. </w:t>
-      </w:r>
-      <w:r>
-        <w:rPr>
-          <w:rFonts w:hint="cs"/>
-          <w:rtl/>
-        </w:rPr>
-        <w:t xml:space="preserve">ناسا و همکاران (۲۰۲۱)</w:t>
+        <w:t xml:space="preserve">در دورهای بعدی، پرسشنامه بر پایه گویه‌های استخراج‌شده از دور نخست بازطراحی شد و از هر عضو پانل خواسته شد میزان اهمیت هر گویه را امتیاز دهد.</w:t>
+      </w:r>
+      <w:r>
+        <w:rPr>
+          <w:rtl/>
+        </w:rPr>
+        <w:t xml:space="preserve"> ناسا و همکاران (۲۰۲۱)</w:t>
       </w:r>
       <w:r>
         <w:rPr>
@@ -1256,19 +1255,13 @@
         <w:rPr>
           <w:rtl/>
         </w:rPr>
-        <w:t xml:space="preserve"> ناشناس ماندن پاسخ‌های اعضای پانل نسبت به یکدیگر، و بازخورد کنترل‌شده نتایج تجمیعی دور پیشین به هر عضو را از ویژگی‌های بنیادین این ابزار در روش دلفی برمی‌شمارند؛ دو ویژگی‌ای که در طراحی پرسشنامه دورهای دوم و سوم پژوهش حاضر رعایت شد. </w:t>
-      </w:r>
-      <w:r>
-        <w:rPr>
-          <w:rtl/>
-        </w:rPr>
-        <w:t xml:space="preserve">پاسخ‌های کامل‌شده اعضای پانل، به دلیل حجم زیاد در متن پایان‌نامه نیامده‌اند و در صورت نیاز در اختیار داوران قرار می‌گیرند</w:t>
-      </w:r>
-      <w:r>
-        <w:rPr>
-          <w:rtl/>
-        </w:rPr>
-        <w:t xml:space="preserve">.</w:t>
+        <w:t xml:space="preserve"> ناشناس ماندن پاسخ‌های اعضای پانل نسبت به یکدیگر، و بازخورد کنترل‌شده نتایج تجمیعی دور پیشین به هر عضو را از ویژگی‌های بنیادین این ابزار در روش دلفی برمی‌شمارند؛ دو ویژگی‌ای که در طراحی پرسشنامه دورهای دوم و سوم پژوهش حاضر رعایت شد.</w:t>
+      </w:r>
+      <w:r>
+        <w:rPr>
+          <w:rtl/>
+        </w:rPr>
+        <w:t xml:space="preserve"> پاسخ‌های کامل‌شده اعضای پانل، به دلیل حجم زیاد در متن پایان‌نامه نیامده‌اند و در صورت نیاز در اختیار داوران قرار می‌گیرند.</w:t>
       </w:r>
     </w:p>
     <w:p>
@@ -1872,14 +1865,13 @@
         <w:rPr>
           <w:rtl/>
         </w:rPr>
-        <w:t xml:space="preserve">برای اولویت‌بندی گویه‌های شناسایی‌شده، فهرست حاصل از دور نخست در دور دوم به صورت پرسشنامه‌ای ساختاریافته در اختیار پانل قرار گرفت و از هر عضو خواسته شد اهمیت هر گویه را بر پایه طیفی پنج‌درجه‌ای رتبه‌بندی کند. </w:t>
-      </w:r>
-      <w:r>
-        <w:rPr>
-          <w:rFonts w:hint="cs"/>
-          <w:rtl/>
-        </w:rPr>
-        <w:t xml:space="preserve">بازخورد کنترل‌شده نتایج هر دور به اعضای پانل، که از ویژگی‌های بنیادین روش دلفی و وجه تمایز آن از پیمایش یک‌مرحله‌ای است (ناسا و همکاران، ۲۰۲۱)</w:t>
+        <w:t xml:space="preserve">برای اولویت‌بندی گویه‌های شناسایی‌شده، فهرست حاصل از دور نخست در دور دوم به صورت پرسشنامه‌ای ساختاریافته در اختیار پانل قرار گرفت و از هر عضو خواسته شد اهمیت هر گویه را بر پایه طیفی پنج‌درجه‌ای امتیاز دهد.</w:t>
+      </w:r>
+      <w:r>
+        <w:rPr>
+          <w:rtl/>
+        </w:rPr>
+        <w:t xml:space="preserve"> بازخورد کنترل‌شده نتایج هر دور به اعضای پانل، که از ویژگی‌های بنیادین روش دلفی و وجه تمایز آن از پیمایش یک‌مرحله‌ای است (ناسا و همکاران، ۲۰۲۱)</w:t>
       </w:r>
       <w:r>
         <w:rPr>
@@ -1889,16 +1881,9 @@
       </w:r>
       <w:r>
         <w:rPr>
-          <w:rFonts w:hint="cs"/>
-          <w:rtl/>
-        </w:rPr>
-        <w:t xml:space="preserve">، در پژوهش حاضر چنین اجرا شد: میانگین و میانه امتیاز هر گویه در پانل، همراه با امتیاز خود هر عضو در دور پیشین، به صورت ناشناس در اختیار تمام اعضا قرار گرفت و از آنان خواسته شد با توجه به این بازخورد گروهی، رتبه‌بندی خود را در دور بعد بازبینی کنند</w:t>
-      </w:r>
-      <w:r>
-        <w:rPr>
-          <w:rtl/>
-        </w:rPr>
-        <w:t xml:space="preserve">.</w:t>
+          <w:rtl/>
+        </w:rPr>
+        <w:t xml:space="preserve">، در پژوهش حاضر چنین اجرا شد: میانگین و میانه امتیاز هر گویه در پانل، همراه با امتیاز خود هر عضو در دور پیشین، به صورت ناشناس در اختیار تمام اعضا قرار گرفت و از آنان خواسته شد با توجه به این بازخورد گروهی، امتیازهای خود را در دور بعد بازبینی کنند.</w:t>
       </w:r>
     </w:p>
     <w:p>
@@ -1910,6 +1895,18 @@
         <w:rPr>
           <w:rtl/>
         </w:rPr>
+        <w:t xml:space="preserve">قاعده حذف گویه‌ها در دور دوم این بود که گویه‌ای با میانگین امتیاز کمتر از ۳ (یعنی کمتر از سطح «تا حدی مهم») از فهرست حذف شود. اگر هیچ گویه‌ای چنین نباشد، فهرست بدون تغییر می‌ماند و ضریب هماهنگی کندال بر کل فهرست محاسبه می‌شود؛ در غیر این صورت، گویه‌های حذف‌شده کنار گذاشته می‌شوند و ضریب کندال بر گویه‌های باقی‌مانده محاسبه می‌شود.</w:t>
+      </w:r>
+    </w:p>
+    <w:p>
+      <w:pPr>
+        <w:bidi/>
+        <w:jc w:val="both"/>
+      </w:pPr>
+      <w:r>
+        <w:rPr>
+          <w:rtl/>
+        </w:rPr>
         <w:t xml:space="preserve">این فرایند تا رسیدن به اجماع نسبی تکرار می‌شود. </w:t>
       </w:r>
       <w:r>
@@ -1960,7 +1957,25 @@
         <w:rPr>
           <w:rtl/>
         </w:rPr>
-        <w:t>رتبه‌بندی نهایی در دو سطح محاسبه شد. در سطح گویه، هر یک از گویه‌های استخراج‌شده از دور نخست امتیاز جداگانه‌ای از میانگین رتبه‌های پانل دریافت کرد. در سطح مؤلفه، امتیاز هر مؤلفه از ترکیب امتیاز گویه‌های زیرمجموعه آن به دست آمد. محاسبه دوسطحی، هم امکان اولویت‌بندی عملیاتی در سطح چالش‌های مشخص را فراهم می‌کند و هم تصویری کلان از اهمیت نسبی دسته‌های چالش ارائه می‌دهد.</w:t>
+        <w:t xml:space="preserve">رتبه‌بندی نهایی در دو سطح محاسبه شد.</w:t>
+      </w:r>
+      <w:r>
+        <w:rPr>
+          <w:rtl/>
+        </w:rPr>
+        <w:t xml:space="preserve"> در سطح گویه، هر یک از گویه‌های استخراج‌شده از دور نخست رتبه‌ای جداگانه بر پایه میانگین امتیاز پانل در دور پایانی گرفت.</w:t>
+      </w:r>
+      <w:r>
+        <w:rPr>
+          <w:rtl/>
+        </w:rPr>
+        <w:t xml:space="preserve"> در سطح مؤلفه، امتیاز هر مؤلفه برابر میانگین امتیاز گویه‌های زیرمجموعه آن است.</w:t>
+      </w:r>
+      <w:r>
+        <w:rPr>
+          <w:rtl/>
+        </w:rPr>
+        <w:t xml:space="preserve"> محاسبه دوسطحی، هم امکان اولویت‌بندی عملیاتی در سطح چالش‌های مشخص را فراهم می‌کند و هم تصویری کلان از اهمیت نسبی دسته‌های چالش ارائه می‌دهد.</w:t>
       </w:r>
     </w:p>
     <w:p>
@@ -1972,13 +1987,19 @@
         <w:rPr>
           <w:rtl/>
         </w:rPr>
-        <w:t xml:space="preserve">برای سنجش آماری این فرایند از سه دسته شاخص استفاده شد. نخست، شاخص‌های توصیفی امتیاز هر گویه در هر دور، یعنی میانگین، میانه، انحراف معیار و دامنه بین‌چارکی. </w:t>
-      </w:r>
-      <w:r>
-        <w:rPr>
-          <w:rtl/>
-        </w:rPr>
-        <w:t xml:space="preserve">دوم، ضریب هماهنگی کندال (W) برای سنجش میزان توافق میان رتبه‌بندی‌های اعضای پانل در هر دور، که در دلفی‌های مبتنی بر رتبه‌بندی به کار می‌رود (اشمیت، ۱۹۹۷)</w:t>
+        <w:t xml:space="preserve">برای سنجش آماری این فرایند از سه دسته شاخص استفاده شد.</w:t>
+      </w:r>
+      <w:r>
+        <w:rPr>
+          <w:rtl/>
+        </w:rPr>
+        <w:t xml:space="preserve"> نخست، شاخص‌های توصیفی امتیاز هر گویه در هر دور، یعنی میانگین، میانه، انحراف معیار و دامنه بین‌چارکی.</w:t>
+      </w:r>
+      <w:r>
+        <w:rPr>
+          <w:rtl/>
+        </w:rPr>
+        <w:t xml:space="preserve"> دوم، ضریب هماهنگی کندال (W) برای سنجش میزان توافق میان رتبه‌های حاصل از امتیازهای اعضای پانل در هر دور، که در دلفی‌های مبتنی بر رتبه‌بندی به کار می‌رود (اشمیت، ۱۹۹۷)</w:t>
       </w:r>
       <w:r>
         <w:rPr>
@@ -1990,37 +2011,19 @@
         <w:rPr>
           <w:rtl/>
         </w:rPr>
-        <w:t xml:space="preserve">؛</w:t>
-      </w:r>
-      <w:r>
-        <w:rPr>
-          <w:rtl/>
-        </w:rPr>
-        <w:t xml:space="preserve"> معناداری آن با آزمون مجذور کای </w:t>
-      </w:r>
-      <w:r>
-        <w:rPr>
-          <w:rtl/>
-        </w:rPr>
-        <w:t xml:space="preserve">ارزیابی می‌شود</w:t>
-      </w:r>
-      <w:r>
-        <w:rPr>
-          <w:rtl/>
-        </w:rPr>
-        <w:t xml:space="preserve">. سوم، ضریب همبستگی رتبه‌ای اسپیرمن میان امتیازهای دور دوم و دور سوم برای سنجش ثبات رتبه‌بندی میان دو دور؛ این ضریب هم در سطح گویه‌ها، که ملاک توقف دورها بود، و هم در سطح مؤلفه‌ها محاسبه شد. </w:t>
-      </w:r>
-      <w:r>
-        <w:rPr>
-          <w:rtl/>
-        </w:rPr>
-        <w:t xml:space="preserve">نتایج این محاسبه‌ها در بخش ۴ گزارش شده است و پاسخ‌های کامل‌شده اعضای پانل در اختیار داوران قرار دارد</w:t>
-      </w:r>
-      <w:r>
-        <w:rPr>
-          <w:rtl/>
-        </w:rPr>
-        <w:t xml:space="preserve">.</w:t>
+        <w:t xml:space="preserve">؛ برای محاسبه آن، امتیازهای هر عضو به رتبه تبدیل شد و امتیازهای برابر میانگین رتبه‌های خود را گرفتند؛ معناداری آن با آزمون مجذور کای ارزیابی می‌شود.</w:t>
+      </w:r>
+      <w:r>
+        <w:rPr>
+          <w:rtl/>
+        </w:rPr>
+        <w:t xml:space="preserve"> سوم، ضریب همبستگی رتبه‌ای اسپیرمن میان امتیازهای دور دوم و دور سوم برای سنجش ثبات رتبه‌بندی میان دو دور؛ این ضریب هم در سطح گویه‌ها، که ملاک توقف دورها بود، و هم در سطح مؤلفه‌ها محاسبه شد.</w:t>
+      </w:r>
+      <w:r>
+        <w:rPr>
+          <w:rtl/>
+        </w:rPr>
+        <w:t xml:space="preserve"> نتایج این محاسبه‌ها در بخش ۴ گزارش شده است و پاسخ‌های کامل‌شده اعضای پانل در اختیار داوران قرار دارد.</w:t>
       </w:r>
     </w:p>
     <w:p>

</xml_diff>

<commit_message>
Use one combining rule and one coding framework
- Coded round-one answers form the items; a literature challenge enters
  the list only when the panel raised it, and a coded item without a
  literature counterpart stays. Every item of the 29 has at least one
  expert code (table 4-6). Chapters two, three and four describe the
  same rule
- Coding follows Braun and Clarke only; the Bingham five-step reference
  is removed from the coding passages and from the reference list
  (34 English entries)

Claude-Session: https://claude.ai/code/session_012d4zYSXkv12fA3MhDxMQzc
</commit_message>
<xml_diff>
--- a/chapter3_revised.docx
+++ b/chapter3_revised.docx
@@ -1187,7 +1187,13 @@
         <w:rPr>
           <w:rtl/>
         </w:rPr>
-        <w:t xml:space="preserve"> پاسخ‌های این دور، مبنای تحلیل مضمون و یکی از دو منبع ورودی فهرست اولیه گویه‌ها شد؛ منبع دیگر، چالش‌های برگرفته از ادبیات در پایان فصل دوم (جدول ۲-۱) بود. این دو منبع در مرحله ترکیب و بررسی با هم سنجیده شدند و فهرست گویه‌هایی که در دورهای بعدی برای رتبه‌بندی و رسیدن به اجماع در اختیار پانل قرار گرفت، از همین مرحله به دست آمد.</w:t>
+        <w:t xml:space="preserve"> پاسخ‌های این دور، مبنای تحلیل مضمون و ساخت گویه‌ها بود.</w:t>
+      </w:r>
+      <w:r>
+        <w:rPr>
+          <w:rtl/>
+        </w:rPr>
+        <w:t xml:space="preserve"> چالش‌های برگرفته از ادبیات در پایان فصل دوم (جدول ۲-۱) در مرحله ترکیب و بررسی با این کدها سنجیده شدند و فهرست گویه‌هایی که در دورهای بعدی برای رتبه‌بندی و رسیدن به اجماع در اختیار پانل قرار گرفت، از همین مرحله به دست آمد.</w:t>
       </w:r>
     </w:p>
     <w:p>
@@ -1353,13 +1359,7 @@
         <w:rPr>
           <w:rtl/>
         </w:rPr>
-        <w:t xml:space="preserve">تحلیل مضمون روشی برای شناسایی، تحلیل و گزارش الگوهای معنایی درون داده‌های کیفی </w:t>
-      </w:r>
-      <w:r>
-        <w:rPr>
-          <w:rtl/>
-        </w:rPr>
-        <w:t xml:space="preserve">است (براون و کلارک، ۲۰۰۶)</w:t>
+        <w:t xml:space="preserve">تحلیل مضمون روشی برای شناسایی، تحلیل و گزارش الگوهای معنایی درون داده‌های کیفی است (براون و کلارک، ۲۰۰۶)</w:t>
       </w:r>
       <w:r>
         <w:rPr>
@@ -1383,31 +1383,25 @@
         <w:rPr>
           <w:rtl/>
         </w:rPr>
-        <w:t xml:space="preserve"> آن را در قالب فرایندی شش‌مرحله‌ای تشریح کرده‌اند؛ مراحل اجرای آن در پژوهش حاضر، با تطبیقی برای پاسخ‌های باز دور نخست دلفی، چنین بود</w:t>
-      </w:r>
-      <w:r>
-        <w:rPr>
-          <w:rtl/>
-        </w:rPr>
-        <w:t xml:space="preserve">. در مرحله نخست، آشنایی با داده: پاسخ‌های باز دور نخست چند بار خوانده شد. در مرحله دوم، کدگذاری باز: هر عبارت معنادار که به مانع یا مشکلی در فرایند فروش اشاره داشت، </w:t>
-      </w:r>
-      <w:r>
-        <w:rPr>
-          <w:rtl/>
-        </w:rPr>
-        <w:t xml:space="preserve">به پیروی از گام کدگذاری باز در فرایند پنج‌مرحله‌ای تحلیل داده کیفی (بینگهام، ۲۰۲۳)</w:t>
-      </w:r>
-      <w:r>
-        <w:rPr>
-          <w:rStyle w:val="FootnoteReference"/>
-        </w:rPr>
-        <w:footnoteReference w:id="9"/>
-      </w:r>
-      <w:r>
-        <w:rPr>
-          <w:rtl/>
-        </w:rPr>
-        <w:t xml:space="preserve"> به عنوان یک کد ثبت شد.</w:t>
+        <w:t xml:space="preserve"> آن را در قالب فرایندی شش‌مرحله‌ای تشریح کرده‌اند؛ مراحل اجرای آن در پژوهش حاضر، با تطبیقی برای پاسخ‌های باز دور نخست دلفی، چنین بود.</w:t>
+      </w:r>
+      <w:r>
+        <w:rPr>
+          <w:rtl/>
+        </w:rPr>
+        <w:t xml:space="preserve"> در مرحله نخست، آشنایی با داده: پاسخ‌های باز دور نخست چند بار خوانده شد.</w:t>
+      </w:r>
+      <w:r>
+        <w:rPr>
+          <w:rtl/>
+        </w:rPr>
+        <w:t xml:space="preserve"> در مرحله دوم، کدگذاری: هر عبارت معنادار که به مانع یا مشکلی در فرایند فروش اشاره داشت، </w:t>
+      </w:r>
+      <w:r>
+        <w:rPr>
+          <w:rtl/>
+        </w:rPr>
+        <w:t xml:space="preserve">به عنوان یک کد ثبت شد.</w:t>
       </w:r>
     </w:p>
     <w:p>
@@ -1859,7 +1853,7 @@
         <w:rPr>
           <w:rtl/>
         </w:rPr>
-        <w:t xml:space="preserve">در مرحله ترکیب و بررسی، کدهای استخراج‌شده از پاسخ‌های دور نخست با چالش‌های برگرفته از ادبیات (جدول ۲-۱) سنجیده و ترکیب شدند. عاملی از ادبیات تنها زمانی وارد فهرست گویه‌ها شد که در پاسخ خبرگان بازتاب داشته باشد؛ عواملی که در ادبیات آمده بودند، اما خبرگان مطرح نکردند، وارد فهرست نشدند. حاصل این مرحله ۲۹ گویه در نُه مؤلفه بود.</w:t>
+        <w:t xml:space="preserve">در مرحله ترکیب و بررسی، کدهای استخراج‌شده از پاسخ‌های دور نخست با چالش‌های برگرفته از ادبیات (جدول ۲-۱) سنجیده و ترکیب شدند. گویه‌ها از کدهای پاسخ خبرگان ساخته شدند و هر گویه دست‌کم در پاسخ یک عضو پانل بازتاب داشت. چالشی از ادبیات تنها زمانی وارد فهرست گویه‌ها شد که خبرگان آن را مطرح کرده بودند؛ چالش‌هایی که در ادبیات آمده بودند، اما هیچ عضو پانل مطرح نکرد، وارد فهرست نشدند. در مقابل، کدی که در ادبیات همتای روشنی نداشت، به‌دلیل بازتاب در پاسخ خبرگان در فهرست ماند. حاصل این مرحله ۲۹ گویه در نُه مؤلفه بود.</w:t>
       </w:r>
     </w:p>
     <w:p>
@@ -1895,13 +1889,63 @@
         <w:rPr>
           <w:rStyle w:val="FootnoteReference"/>
         </w:rPr>
+        <w:footnoteReference w:id="9"/>
+      </w:r>
+      <w:r>
+        <w:rPr>
+          <w:rtl/>
+        </w:rPr>
+        <w:t xml:space="preserve">، در پژوهش حاضر چنین اجرا شد: میانگین و میانه امتیاز هر گویه در پانل، همراه با امتیاز خود هر عضو در دور پیشین، به صورت ناشناس در اختیار تمام اعضا قرار گرفت و از آنان خواسته شد با توجه به این بازخورد گروهی، امتیازهای خود را در دور بعد بازبینی کنند.</w:t>
+      </w:r>
+    </w:p>
+    <w:p>
+      <w:pPr>
+        <w:bidi/>
+        <w:jc w:val="both"/>
+      </w:pPr>
+      <w:r>
+        <w:rPr>
+          <w:rtl/>
+        </w:rPr>
+        <w:t xml:space="preserve">این فرایند تا رسیدن به اجماع نسبی تکرار می‌شود. </w:t>
+      </w:r>
+      <w:r>
+        <w:rPr>
+          <w:rFonts w:hint="cs"/>
+          <w:rtl/>
+        </w:rPr>
+        <w:t xml:space="preserve">شیفانو و نیدربرگر (۲۰۲۵)</w:t>
+      </w:r>
+      <w:r>
+        <w:rPr>
+          <w:rStyle w:val="FootnoteReference"/>
+        </w:rPr>
         <w:footnoteReference w:id="10"/>
       </w:r>
       <w:r>
         <w:rPr>
-          <w:rtl/>
-        </w:rPr>
-        <w:t xml:space="preserve">، در پژوهش حاضر چنین اجرا شد: میانگین و میانه امتیاز هر گویه در پانل، همراه با امتیاز خود هر عضو در دور پیشین، به صورت ناشناس در اختیار تمام اعضا قرار گرفت و از آنان خواسته شد با توجه به این بازخورد گروهی، امتیازهای خود را در دور بعد بازبینی کنند.</w:t>
+          <w:rFonts w:hint="cs"/>
+          <w:rtl/>
+        </w:rPr>
+        <w:t xml:space="preserve"> در مرور دامنه‌ای خود بر مطالعات دلفی در علوم سلامت نشان دادند که اجماع در بیشتر مطالعات (۸۱ درصد) به صورت درصد توافق تعریف می‌شود و ملاک توقف دورها در آن‌ها دستیابی به اجماع، تعداد ثابتی از دورها، یا ثبات پاسخ‌ها میان دورها (مثلاً با تغییر میانگین‌ها یا دامنه بین‌چارکی) است</w:t>
+      </w:r>
+      <w:r>
+        <w:rPr>
+          <w:rtl/>
+        </w:rPr>
+        <w:t xml:space="preserve">. </w:t>
+      </w:r>
+      <w:r>
+        <w:rPr>
+          <w:rtl/>
+        </w:rPr>
+        <w:t xml:space="preserve">در پژوهش حاضر توقف دورها بر پایه ملاک ثبات</w:t>
+      </w:r>
+      <w:r>
+        <w:rPr>
+          <w:rtl/>
+        </w:rPr>
+        <w:t xml:space="preserve">، یعنی ثبات نسبی رتبه‌بندی گویه‌ها میان دو دور متوالی، تعیین شد.</w:t>
       </w:r>
     </w:p>
     <w:p>
@@ -1913,105 +1957,55 @@
         <w:rPr>
           <w:rtl/>
         </w:rPr>
-        <w:t xml:space="preserve">این فرایند تا رسیدن به اجماع نسبی تکرار می‌شود. </w:t>
-      </w:r>
-      <w:r>
-        <w:rPr>
-          <w:rFonts w:hint="cs"/>
-          <w:rtl/>
-        </w:rPr>
-        <w:t xml:space="preserve">شیفانو و نیدربرگر (۲۰۲۵)</w:t>
+        <w:t xml:space="preserve">رتبه‌بندی نهایی در دو سطح محاسبه شد.</w:t>
+      </w:r>
+      <w:r>
+        <w:rPr>
+          <w:rtl/>
+        </w:rPr>
+        <w:t xml:space="preserve"> در سطح گویه، هر یک از گویه‌های استخراج‌شده از دور نخست رتبه‌ای جداگانه بر پایه میانگین امتیاز پانل در دور پایانی گرفت.</w:t>
+      </w:r>
+      <w:r>
+        <w:rPr>
+          <w:rtl/>
+        </w:rPr>
+        <w:t xml:space="preserve"> در سطح مؤلفه، امتیاز هر مؤلفه برابر میانگین امتیاز گویه‌های زیرمجموعه آن است.</w:t>
+      </w:r>
+      <w:r>
+        <w:rPr>
+          <w:rtl/>
+        </w:rPr>
+        <w:t xml:space="preserve"> محاسبه دوسطحی، هم امکان اولویت‌بندی عملیاتی در سطح چالش‌های مشخص را فراهم می‌کند و هم تصویری کلان از اهمیت نسبی دسته‌های چالش ارائه می‌دهد.</w:t>
+      </w:r>
+    </w:p>
+    <w:p>
+      <w:pPr>
+        <w:bidi/>
+        <w:jc w:val="both"/>
+      </w:pPr>
+      <w:r>
+        <w:rPr>
+          <w:rtl/>
+        </w:rPr>
+        <w:t xml:space="preserve">برای سنجش آماری این فرایند از سه دسته شاخص استفاده شد.</w:t>
+      </w:r>
+      <w:r>
+        <w:rPr>
+          <w:rtl/>
+        </w:rPr>
+        <w:t xml:space="preserve"> نخست، شاخص‌های توصیفی امتیاز هر گویه در هر دور، یعنی میانگین، میانه، انحراف معیار و دامنه بین‌چارکی.</w:t>
+      </w:r>
+      <w:r>
+        <w:rPr>
+          <w:rtl/>
+        </w:rPr>
+        <w:t xml:space="preserve"> دوم، ضریب هماهنگی کندال (W) برای سنجش میزان توافق میان رتبه‌های حاصل از امتیازهای اعضای پانل در هر دور، که در دلفی‌های مبتنی بر رتبه‌بندی به کار می‌رود (اشمیت، ۱۹۹۷)</w:t>
       </w:r>
       <w:r>
         <w:rPr>
           <w:rStyle w:val="FootnoteReference"/>
         </w:rPr>
         <w:footnoteReference w:id="11"/>
-      </w:r>
-      <w:r>
-        <w:rPr>
-          <w:rFonts w:hint="cs"/>
-          <w:rtl/>
-        </w:rPr>
-        <w:t xml:space="preserve"> در مرور دامنه‌ای خود بر مطالعات دلفی در علوم سلامت نشان دادند که اجماع در بیشتر مطالعات (۸۱ درصد) به صورت درصد توافق تعریف می‌شود و ملاک توقف دورها در آن‌ها دستیابی به اجماع، تعداد ثابتی از دورها، یا ثبات پاسخ‌ها میان دورها (مثلاً با تغییر میانگین‌ها یا دامنه بین‌چارکی) است</w:t>
-      </w:r>
-      <w:r>
-        <w:rPr>
-          <w:rtl/>
-        </w:rPr>
-        <w:t xml:space="preserve">. </w:t>
-      </w:r>
-      <w:r>
-        <w:rPr>
-          <w:rtl/>
-        </w:rPr>
-        <w:t xml:space="preserve">در پژوهش حاضر توقف دورها بر پایه ملاک ثبات</w:t>
-      </w:r>
-      <w:r>
-        <w:rPr>
-          <w:rtl/>
-        </w:rPr>
-        <w:t xml:space="preserve">، یعنی ثبات نسبی رتبه‌بندی گویه‌ها میان دو دور متوالی، تعیین شد.</w:t>
-      </w:r>
-    </w:p>
-    <w:p>
-      <w:pPr>
-        <w:bidi/>
-        <w:jc w:val="both"/>
-      </w:pPr>
-      <w:r>
-        <w:rPr>
-          <w:rtl/>
-        </w:rPr>
-        <w:t xml:space="preserve">رتبه‌بندی نهایی در دو سطح محاسبه شد.</w:t>
-      </w:r>
-      <w:r>
-        <w:rPr>
-          <w:rtl/>
-        </w:rPr>
-        <w:t xml:space="preserve"> در سطح گویه، هر یک از گویه‌های استخراج‌شده از دور نخست رتبه‌ای جداگانه بر پایه میانگین امتیاز پانل در دور پایانی گرفت.</w:t>
-      </w:r>
-      <w:r>
-        <w:rPr>
-          <w:rtl/>
-        </w:rPr>
-        <w:t xml:space="preserve"> در سطح مؤلفه، امتیاز هر مؤلفه برابر میانگین امتیاز گویه‌های زیرمجموعه آن است.</w:t>
-      </w:r>
-      <w:r>
-        <w:rPr>
-          <w:rtl/>
-        </w:rPr>
-        <w:t xml:space="preserve"> محاسبه دوسطحی، هم امکان اولویت‌بندی عملیاتی در سطح چالش‌های مشخص را فراهم می‌کند و هم تصویری کلان از اهمیت نسبی دسته‌های چالش ارائه می‌دهد.</w:t>
-      </w:r>
-    </w:p>
-    <w:p>
-      <w:pPr>
-        <w:bidi/>
-        <w:jc w:val="both"/>
-      </w:pPr>
-      <w:r>
-        <w:rPr>
-          <w:rtl/>
-        </w:rPr>
-        <w:t xml:space="preserve">برای سنجش آماری این فرایند از سه دسته شاخص استفاده شد.</w:t>
-      </w:r>
-      <w:r>
-        <w:rPr>
-          <w:rtl/>
-        </w:rPr>
-        <w:t xml:space="preserve"> نخست، شاخص‌های توصیفی امتیاز هر گویه در هر دور، یعنی میانگین، میانه، انحراف معیار و دامنه بین‌چارکی.</w:t>
-      </w:r>
-      <w:r>
-        <w:rPr>
-          <w:rtl/>
-        </w:rPr>
-        <w:t xml:space="preserve"> دوم، ضریب هماهنگی کندال (W) برای سنجش میزان توافق میان رتبه‌های حاصل از امتیازهای اعضای پانل در هر دور، که در دلفی‌های مبتنی بر رتبه‌بندی به کار می‌رود (اشمیت، ۱۹۹۷)</w:t>
-      </w:r>
-      <w:r>
-        <w:rPr>
-          <w:rStyle w:val="FootnoteReference"/>
-        </w:rPr>
-        <w:footnoteReference w:id="12"/>
       </w:r>
       <w:r>
         <w:rPr>
@@ -2059,7 +2053,7 @@
         <w:rPr>
           <w:rStyle w:val="FootnoteReference"/>
         </w:rPr>
-        <w:footnoteReference w:id="13"/>
+        <w:footnoteReference w:id="12"/>
       </w:r>
       <w:r>
         <w:rPr>
@@ -2162,102 +2156,102 @@
         <w:rPr>
           <w:rStyle w:val="FootnoteReference"/>
         </w:rPr>
+        <w:footnoteReference w:id="13"/>
+      </w:r>
+      <w:r>
+        <w:rPr>
+          <w:rtl/>
+        </w:rPr>
+        <w:t xml:space="preserve"> آن را از ویژگی‌های اصلی این روش دانسته‌اند.</w:t>
+      </w:r>
+    </w:p>
+    <w:p>
+      <w:pPr>
+        <w:bidi/>
+        <w:jc w:val="both"/>
+      </w:pPr>
+      <w:r>
+        <w:rPr>
+          <w:rtl/>
+        </w:rPr>
+        <w:t xml:space="preserve">اندازه پانل پژوهش حاضر </w:t>
+      </w:r>
+      <w:r>
+        <w:rPr>
+          <w:rFonts w:hint="cs"/>
+          <w:rtl/>
+        </w:rPr>
+        <w:t>هفت</w:t>
+      </w:r>
+      <w:r>
+        <w:rPr>
+          <w:rtl/>
+        </w:rPr>
+        <w:t xml:space="preserve"> </w:t>
+      </w:r>
+      <w:r>
+        <w:rPr>
+          <w:rFonts w:hint="cs"/>
+          <w:rtl/>
+        </w:rPr>
+        <w:t>نفر</w:t>
+      </w:r>
+      <w:r>
+        <w:rPr>
+          <w:rtl/>
+        </w:rPr>
+        <w:t xml:space="preserve"> </w:t>
+      </w:r>
+      <w:r>
+        <w:rPr>
+          <w:rFonts w:hint="cs"/>
+          <w:rtl/>
+        </w:rPr>
+        <w:t>در</w:t>
+      </w:r>
+      <w:r>
+        <w:rPr>
+          <w:rtl/>
+        </w:rPr>
+        <w:t xml:space="preserve"> </w:t>
+      </w:r>
+      <w:r>
+        <w:rPr>
+          <w:rFonts w:hint="cs"/>
+          <w:rtl/>
+        </w:rPr>
+        <w:t>محدوده‌ای</w:t>
+      </w:r>
+      <w:r>
+        <w:rPr>
+          <w:rtl/>
+        </w:rPr>
+        <w:t xml:space="preserve"> </w:t>
+      </w:r>
+      <w:r>
+        <w:rPr>
+          <w:rFonts w:hint="cs"/>
+          <w:rtl/>
+        </w:rPr>
+        <w:t>است</w:t>
+      </w:r>
+      <w:r>
+        <w:rPr>
+          <w:rtl/>
+        </w:rPr>
+        <w:t xml:space="preserve"> </w:t>
+      </w:r>
+      <w:r>
+        <w:rPr>
+          <w:rtl/>
+        </w:rPr>
+        <w:t>که شیفانو و نیدربرگر (۲۰۲۵)</w:t>
+      </w:r>
+      <w:r>
+        <w:rPr>
+          <w:rStyle w:val="FootnoteReference"/>
+        </w:rPr>
         <w:footnoteReference w:id="14"/>
-      </w:r>
-      <w:r>
-        <w:rPr>
-          <w:rtl/>
-        </w:rPr>
-        <w:t xml:space="preserve"> آن را از ویژگی‌های اصلی این روش دانسته‌اند.</w:t>
-      </w:r>
-    </w:p>
-    <w:p>
-      <w:pPr>
-        <w:bidi/>
-        <w:jc w:val="both"/>
-      </w:pPr>
-      <w:r>
-        <w:rPr>
-          <w:rtl/>
-        </w:rPr>
-        <w:t xml:space="preserve">اندازه پانل پژوهش حاضر </w:t>
-      </w:r>
-      <w:r>
-        <w:rPr>
-          <w:rFonts w:hint="cs"/>
-          <w:rtl/>
-        </w:rPr>
-        <w:t>هفت</w:t>
-      </w:r>
-      <w:r>
-        <w:rPr>
-          <w:rtl/>
-        </w:rPr>
-        <w:t xml:space="preserve"> </w:t>
-      </w:r>
-      <w:r>
-        <w:rPr>
-          <w:rFonts w:hint="cs"/>
-          <w:rtl/>
-        </w:rPr>
-        <w:t>نفر</w:t>
-      </w:r>
-      <w:r>
-        <w:rPr>
-          <w:rtl/>
-        </w:rPr>
-        <w:t xml:space="preserve"> </w:t>
-      </w:r>
-      <w:r>
-        <w:rPr>
-          <w:rFonts w:hint="cs"/>
-          <w:rtl/>
-        </w:rPr>
-        <w:t>در</w:t>
-      </w:r>
-      <w:r>
-        <w:rPr>
-          <w:rtl/>
-        </w:rPr>
-        <w:t xml:space="preserve"> </w:t>
-      </w:r>
-      <w:r>
-        <w:rPr>
-          <w:rFonts w:hint="cs"/>
-          <w:rtl/>
-        </w:rPr>
-        <w:t>محدوده‌ای</w:t>
-      </w:r>
-      <w:r>
-        <w:rPr>
-          <w:rtl/>
-        </w:rPr>
-        <w:t xml:space="preserve"> </w:t>
-      </w:r>
-      <w:r>
-        <w:rPr>
-          <w:rFonts w:hint="cs"/>
-          <w:rtl/>
-        </w:rPr>
-        <w:t>است</w:t>
-      </w:r>
-      <w:r>
-        <w:rPr>
-          <w:rtl/>
-        </w:rPr>
-        <w:t xml:space="preserve"> </w:t>
-      </w:r>
-      <w:r>
-        <w:rPr>
-          <w:rtl/>
-        </w:rPr>
-        <w:t>که شیفانو و نیدربرگر (۲۰۲۵)</w:t>
-      </w:r>
-      <w:r>
-        <w:rPr>
-          <w:rStyle w:val="FootnoteReference"/>
-        </w:rPr>
-        <w:footnoteReference w:id="15"/>
       </w:r>
       <w:r>
         <w:rPr>
@@ -2538,7 +2532,7 @@
           <w:sz w:val="20"/>
           <w:szCs w:val="20"/>
         </w:rPr>
-        <w:t xml:space="preserve"> Bingham, 2023</w:t>
+        <w:t xml:space="preserve"> Nasa et al., 2021</w:t>
       </w:r>
     </w:p>
   </w:footnote>
@@ -2556,7 +2550,7 @@
           <w:sz w:val="20"/>
           <w:szCs w:val="20"/>
         </w:rPr>
-        <w:t xml:space="preserve"> Nasa et al., 2021</w:t>
+        <w:t xml:space="preserve"> Schifano &amp; Niederberger, 2025</w:t>
       </w:r>
     </w:p>
   </w:footnote>
@@ -2574,7 +2568,7 @@
           <w:sz w:val="20"/>
           <w:szCs w:val="20"/>
         </w:rPr>
-        <w:t xml:space="preserve"> Schifano &amp; Niederberger, 2025</w:t>
+        <w:t xml:space="preserve"> Schmidt, 1997</w:t>
       </w:r>
     </w:p>
   </w:footnote>
@@ -2592,7 +2586,7 @@
           <w:sz w:val="20"/>
           <w:szCs w:val="20"/>
         </w:rPr>
-        <w:t xml:space="preserve"> Schmidt, 1997</w:t>
+        <w:t xml:space="preserve"> Saaty, 1980. The analytic hierarchy process.</w:t>
       </w:r>
     </w:p>
   </w:footnote>
@@ -2610,29 +2604,11 @@
           <w:sz w:val="20"/>
           <w:szCs w:val="20"/>
         </w:rPr>
-        <w:t xml:space="preserve"> Saaty, 1980. The analytic hierarchy process.</w:t>
+        <w:t xml:space="preserve"> Nasa et al., 2021</w:t>
       </w:r>
     </w:p>
   </w:footnote>
   <w:footnote w:id="14">
-    <w:p>
-      <w:r>
-        <w:rPr>
-          <w:rStyle w:val="FootnoteReference"/>
-        </w:rPr>
-        <w:footnoteRef/>
-      </w:r>
-      <w:r>
-        <w:rPr>
-          <w:rFonts w:ascii="Times New Roman" w:eastAsia="Times New Roman" w:hAnsi="Times New Roman" w:cs="Times New Roman"/>
-          <w:sz w:val="20"/>
-          <w:szCs w:val="20"/>
-        </w:rPr>
-        <w:t xml:space="preserve"> Nasa et al., 2021</w:t>
-      </w:r>
-    </w:p>
-  </w:footnote>
-  <w:footnote w:id="15">
     <w:p>
       <w:r>
         <w:rPr>

</xml_diff>

<commit_message>
Make the AHP section of chapter 4 easier to follow
- Section 4-6-2 now opens with what AHP does and why the Delphi means
  are turned into weights, then reports four headed steps: the
  questionnaire, the weight of every item, the nine components and
  their weights, and an explicit answer to question two
- The two weight formulas are shown on their own lines with a worked
  example each, and the weights are read in plain terms (share of the
  total, ratio of the largest to the smallest)
- Table 4-11 shows the row of each item in Table 4-6; Table 4-12 shows
  which rows of Table 4-6 belong to each component
- Chapter 3 (3-7-3) gives the same two formulas in the method section

Claude-Session: https://claude.ai/code/session_012d4zYSXkv12fA3MhDxMQzc
</commit_message>
<xml_diff>
--- a/chapter3_revised.docx
+++ b/chapter3_revised.docx
@@ -2095,7 +2095,21 @@
         <w:rPr>
           <w:rtl/>
         </w:rPr>
-        <w:t xml:space="preserve"> در این گام، نخست پرسشنامه‌ی دور سوم، که ۲۹ گویه را در بر داشت (پیوست پ)، میان هر هفت عضو پانل توزیع شد و هر عضو اهمیت هر گویه را بر طیف پنج‌درجه‌ای امتیاز داد. سپس میانگین امتیاز هر گویه محاسبه شد و وزن هر گویه برابر سهم میانگین آن از مجموع میانگین‌های ۲۹ گویه قرار گرفت؛ مجموع وزن گویه‌ها برابر یک است. وزن‌ها بدون محاسبه‌ی مقایسه‌های زوجی و مستقیماً از امتیازهای پرسشنامه به دست آمدند.</w:t>
+        <w:t xml:space="preserve"> در این روش امتیازها به وزن‌هایی تبدیل می‌شوند که مجموعشان یک است و وزن بیشتر یعنی اولویت بالاتر؛ مسئله در سه سطح چیده می‌شود: هدف، که اولویت‌بندی چالش‌های فروش است، مؤلفه‌ها و گویه‌ها. در این پژوهش وزن‌ها بدون محاسبه‌ی مقایسه‌های زوجی و مستقیماً از امتیازهای پرسشنامه به دست آمدند. نخست پرسشنامه‌ی دور سوم، که ۲۹ گویه را در بر داشت (پیوست پ)، میان هر هفت عضو پانل توزیع شد و هر عضو اهمیت هر گویه را بر طیف پنج‌درجه‌ای امتیاز داد. سپس میانگین امتیاز هر گویه محاسبه شد و وزن هر گویه، یعنی سهم آن از مجموع امتیازها، چنین به دست آمد:</w:t>
+      </w:r>
+    </w:p>
+    <w:p>
+      <w:pPr>
+        <w:bidi/>
+        <w:spacing w:before="80" w:after="140"/>
+        <w:ind w:firstLine="0"/>
+        <w:jc w:val="center"/>
+      </w:pPr>
+      <w:r>
+        <w:rPr>
+          <w:rtl/>
+        </w:rPr>
+        <w:t xml:space="preserve">وزن گویه = میانگین امتیاز گویه تقسیم بر مجموع میانگین امتیاز ۲۹ گویه</w:t>
       </w:r>
     </w:p>
     <w:p>
@@ -2107,7 +2121,33 @@
         <w:rPr>
           <w:rtl/>
         </w:rPr>
-        <w:t xml:space="preserve">پس از وزن‌دهی گویه‌ها، سلسله‌مراتب تصمیم در سه سطح تشکیل شد: هدف، که شناسایی و اولویت‌بندی چالش‌های فروش است؛ مؤلفه‌ها؛ و ۲۹ گویه زیر آن‌ها. برای این منظور گویه‌ها بر پایه شباهت مضمونی در نُه مؤلفه سازمان‌دهی شدند. وزن هر مؤلفه از وزن گویه‌های آن به دست آمد: میانگین وزن گویه‌های هر مؤلفه محاسبه و بر مجموع این میانگین‌ها در نُه مؤلفه تقسیم شد تا مجموع وزن مؤلفه‌ها برابر یک شود. به‌کار بردن میانگین به‌جای مجموع از آن روست که شمار گویه‌های هر مؤلفه، که از شیوه‌ی دسته‌بندی ناشی می‌شود و نه از اهمیت چالش، بر وزن آن اثر نگذارد. نتایج این وزن‌دهی در بخش ۴-۶-۲ گزارش شده است.</w:t>
+        <w:t xml:space="preserve">مجموع وزن گویه‌ها برابر یک است. پس از آن، گویه‌ها بر پایه شباهت مضمونی در نُه مؤلفه سازمان‌دهی شدند و وزن هر مؤلفه از وزن گویه‌های آن به دست آمد: میانگین وزن گویه‌های هر مؤلفه محاسبه و، برای آنکه مجموع وزن مؤلفه‌ها برابر یک شود، بر مجموع این میانگین‌ها در نُه مؤلفه تقسیم شد. چون وزن هر گویه با میانگین امتیاز آن متناسب است، همین وزن از رابطه زیر نیز به دست می‌آید:</w:t>
+      </w:r>
+    </w:p>
+    <w:p>
+      <w:pPr>
+        <w:bidi/>
+        <w:spacing w:before="80" w:after="140"/>
+        <w:ind w:firstLine="0"/>
+        <w:jc w:val="center"/>
+      </w:pPr>
+      <w:r>
+        <w:rPr>
+          <w:rtl/>
+        </w:rPr>
+        <w:t xml:space="preserve">وزن مؤلفه = میانگین امتیاز مؤلفه تقسیم بر مجموع میانگین‌های نُه مؤلفه</w:t>
+      </w:r>
+    </w:p>
+    <w:p>
+      <w:pPr>
+        <w:bidi/>
+        <w:jc w:val="both"/>
+      </w:pPr>
+      <w:r>
+        <w:rPr>
+          <w:rtl/>
+        </w:rPr>
+        <w:t xml:space="preserve">به‌کار بردن میانگین به‌جای مجموع از آن روست که شمار گویه‌های هر مؤلفه، که از شیوه‌ی دسته‌بندی ناشی می‌شود و نه از اهمیت چالش، بر وزن آن اثر نگذارد. نتایج این وزن‌دهی در بخش ۴-۶-۲ گزارش شده است.</w:t>
       </w:r>
     </w:p>
     <w:p>

</xml_diff>